<commit_message>
feat: full run and render
</commit_message>
<xml_diff>
--- a/products/manuscript.docx
+++ b/products/manuscript.docx
@@ -543,7 +543,7 @@
         <w:t xml:space="preserve"> </w:t>
       </w:r>
       <w:r>
-        <w:t xml:space="preserve">Co-corresponding authors</w:t>
+        <w:t xml:space="preserve">Corresponding authors</w:t>
       </w:r>
     </w:p>
     <w:p>
@@ -722,7 +722,7 @@
         <w:pStyle w:val="BodyText"/>
       </w:pPr>
       <w:r>
-        <w:t xml:space="preserve">A key feature of any therapeutic is the dose. For norovirus, viral dose is known to be associated with infection risk</w:t>
+        <w:t xml:space="preserve">A key feature of any therapeutic intervention is the dose. For norovirus, viral dose is known to be associated with infection risk</w:t>
       </w:r>
       <w:r>
         <w:t xml:space="preserve"> </w:t>
@@ -780,7 +780,7 @@
         </w:r>
       </w:hyperlink>
       <w:r>
-        <w:t xml:space="preserve">; see Material and Methods and</w:t>
+        <w:t xml:space="preserve">; see Materials and Methods and</w:t>
       </w:r>
       <w:r>
         <w:t xml:space="preserve"> </w:t>
@@ -873,7 +873,7 @@
               <w:t xml:space="preserve"> </w:t>
             </w:r>
             <w:r>
-              <w:t xml:space="preserve">Norovirus infection (NI) and vaccination (NV) study designs. Panel A shows the NI study. Participants were randomized to be challenged with 4.8, 48, or 4800 RT-PCR units of Norwalk virus. Serum samples were collected on days 0, 2, 7, 14, 28, and 180, and antibody responses to GI.1 HBGA-blocking, IgA, and IgG were measured. GI.1 IgA and IgG were assessed at all timepoints, whereas HBGA-blocking antibody measurements were only available on days 0, 14, 28, and 180. Panel B shows the NV study. Participants were randomized to receive a bivalent (GI.1 and GII.4) VLP vaccine at doses of 5, 15, 50, or 150mcg of each component. A second dose was administered 28 days after the first. Serum samples were collected on days 0, 7, 21, 28, 35, 56, 180, and 393. Antibody responses were measured for GI.1 HBGA-blocking, IgA, and IgG, as well as GII.4 IgA and IgG. Figure created in BioRender. Handel, A. (2026) https://BioRender.com/p3sb4gj.</w:t>
+              <w:t xml:space="preserve">Norovirus infection (NI) and vaccination (NV) study designs. Panel A shows the NI study. Participants were randomized to be challenged with 4.8, 48, or 4800 RT-PCR units of Norwalk virus. Serum samples were collected on days 0, 2, 7, 14, 28, and 180, and antibody responses to GI.1 HBGA-blocking, IgA, and IgG were measured. GI.1 IgA and IgG were assessed at all time points, whereas HBGA-blocking antibody measurements were only available on days 0, 14, 28, and 180. Panel B shows the NV study. Participants were randomized to receive a bivalent (GI.1 and GII.4) VLP vaccine at doses of 5, 15, 50, or 150 mcg of each component. A second dose was administered 28 days after the first. Serum samples were collected on days 0, 7, 21, 28, 35, 56, 180, and 393. Antibody responses were measured for GI.1 HBGA-blocking, IgA, and IgG, as well as GII.4 IgA and IgG. Figure created in BioRender. Handel, A. (2026) https://BioRender.com/p3sb4gj.</w:t>
             </w:r>
           </w:p>
           <w:bookmarkEnd w:id="28"/>
@@ -1009,7 +1009,7 @@
               <w:t xml:space="preserve"> </w:t>
             </w:r>
             <w:r>
-              <w:t xml:space="preserve">Data and fitted antibody kinetics in the Norovirus Infection (NI) study, by dose group and antibody type among those infected. Orange solid lines represent the exponential decay model, and blue dashed lines represent the power-law decay model. Ninety-five percent credible intervals based on the median and median absolute deviation (MAD) are shown as ribbons around the trajectories. Points represent the observed data, and censored observations are denoted with triangles plotted at the limit of detection. For a summary of the censored observations at each time point, see SM S2.3.1.</w:t>
+              <w:t xml:space="preserve">Data and fitted antibody kinetics in the Norovirus Infection (NI) study, by dose group and antibody type among those infected. Orange solid lines represent the exponential decay model, and blue dashed lines represent the power-law decay model. Ninety-five percent equal-tailed credible intervals are shown as ribbons around the trajectories. Points represent the observed data, and censored observations are denoted with triangles plotted at the limit of detection. For a summary of the censored observations at each time point, see SM S2.3.1.</w:t>
             </w:r>
           </w:p>
           <w:bookmarkEnd w:id="32"/>
@@ -1102,7 +1102,7 @@
               <w:t xml:space="preserve"> </w:t>
             </w:r>
             <w:r>
-              <w:t xml:space="preserve">Data and fitted antibody kinetics in the Norovirus Vaccination (NV) study, by dose group and antibody type. Orange solid lines represent the exponential decay model, and blue dashed lines represent the power-law decay model. Ninety-five percent credible intervals based on the median and median absolute deviation (MAD) are shown as ribbons around the trajectories. Points represent the observed data, and censored observations are denoted with triangles plotted at the limit of detection. For a summary of the censored observations at each time point, see SM S2.3.1.</w:t>
+              <w:t xml:space="preserve">Data and fitted antibody kinetics in the Norovirus Vaccination (NV) study, by dose group and antibody type. Orange solid lines represent the exponential decay model, and blue dashed lines represent the power-law decay model. Ninety-five percent equal-tailed credible intervals are shown as ribbons around the trajectories. Points represent the observed data, and censored observations are denoted with triangles plotted at the limit of detection. For a summary of the censored observations at each time point, see SM S2.3.1.</w:t>
             </w:r>
           </w:p>
           <w:bookmarkEnd w:id="36"/>
@@ -1114,7 +1114,7 @@
         <w:pStyle w:val="BodyText"/>
       </w:pPr>
       <w:r>
-        <w:t xml:space="preserve">We compared the predictive performance of the exponential and power-law decay models. We found that the power-law model outperformed the exponential model in all cases expect the NI GI.1 HBGA-blocking scenario (</w:t>
+        <w:t xml:space="preserve">We compared the predictive performance of the exponential and power-law decay models. We found that the power-law model outperformed the exponential model in all cases except the NI GI.1 HBGA-blocking scenario (</w:t>
       </w:r>
       <w:hyperlink w:anchor="tbl-table1">
         <w:r>
@@ -1152,7 +1152,7 @@
               <w:pStyle w:val="ImageCaption"/>
             </w:pPr>
             <w:r>
-              <w:t xml:space="preserve">Table 1: Comparison of exponential and power-law decay models for each study and antibody. Differences in total expected log predictive density (ΔELPD), their standard errors (ΔSE), and the probability that the power-law model has better predictive performance than the exponential model (P(ΔELPD&gt;0)) are shown. Positive ΔELPD values and P(ΔELPD&gt;0) values near 1 and indicate superior performance of the power-law model.</w:t>
+              <w:t xml:space="preserve">Table 1: Comparison of exponential and power-law decay models for each study and antibody. Differences in total expected log predictive density (ΔELPD), their standard errors (ΔSE), and the probability that the power-law model has better predictive performance than the exponential model (P(ΔELPD&gt;0)) are shown. Positive ΔELPD values and P(ΔELPD&gt;0) values near 1 indicate superior performance of the power-law model.</w:t>
             </w:r>
           </w:p>
           <w:tbl xmlns:w="http://schemas.openxmlformats.org/wordprocessingml/2006/main" xmlns:r="http://schemas.openxmlformats.org/officeDocument/2006/relationships" xmlns:w14="http://schemas.microsoft.com/office/word/2010/wordml" xmlns:wp="http://schemas.openxmlformats.org/drawingml/2006/wordprocessingDrawing" xmlns:a="http://schemas.openxmlformats.org/drawingml/2006/main" xmlns:pic="http://schemas.openxmlformats.org/drawingml/2006/picture">
@@ -3664,7 +3664,7 @@
         <w:pStyle w:val="FirstParagraph"/>
       </w:pPr>
       <w:r>
-        <w:t xml:space="preserve">Using model-predicted antibody trajectories, we estimated growth rate, peak response (fold change), time of peak, decay rate at day 90, and predicted response (fold change) at one year. Antibody induction and persistence varied by infection dose across antibody types (</w:t>
+        <w:t xml:space="preserve">Using model-predicted antibody trajectories, we estimated growth rate, peak response, time of peak, decay rate at day 90, and predicted response at one year. Antibody induction and persistence varied by infection dose across antibody types (</w:t>
       </w:r>
       <w:hyperlink w:anchor="fig-ni-measures">
         <w:r>
@@ -3780,7 +3780,7 @@
               <w:t xml:space="preserve"> </w:t>
             </w:r>
             <w:r>
-              <w:t xml:space="preserve">Power-law model-derived antibody kinetic measures following norovirus infection by challenge dose. Growth rate (per day), peak response (fold change), time of peak (days), decay rate (per day; evaluated at day 90), and predicted response at one year (fold change) are shown, with rows corresponding to kinetic measure and columns corresponding to antibody type. Solid points denote population-level posterior estimates, with vertical lines indicating 95% MAD-based credible intervals (CIs). For visualization purposes, the y-axis scales for growth rate and time to peak were truncated. The upper bounds of the 95% CIs for the GI.1 HBGA-blocking antibody growth rate at doses 4.8, 48, and 4800 were 2.49, 2.00, and 1.46, respectively.</w:t>
+              <w:t xml:space="preserve">Power-law model-derived antibody kinetic measures following norovirus infection by challenge dose. Growth rate (per day), peak response, time of peak (days), decay rate (per day; evaluated at day 90), and predicted response at one year are shown, with rows corresponding to kinetic measure and columns corresponding to antibody type. Solid points denote population-level posterior estimates, with vertical lines indicating 95% equal-tailed credible intervals (CIs). For visualization purposes, the y-axis scales for growth rate and time to peak were truncated. The upper bounds of the 95% CIs for the GI.1 HBGA-blocking antibody growth rate at doses 4.8, 48, and 4800 were 2.49, 2.00, and 1.46, respectively.</w:t>
             </w:r>
           </w:p>
           <w:bookmarkEnd w:id="42"/>
@@ -3888,7 +3888,7 @@
         <w:pStyle w:val="BodyText"/>
       </w:pPr>
       <w:r>
-        <w:t xml:space="preserve">For GII.4 antibodies, peak responses followed a non-monotone pattern, increasing up to the 50 dose and declining at the 150 dose for both IgA and IgG (Pr(50 &gt; 150) = 0.99 and 0.95, respectively). The 150 dose also decayed more slowly than the other doses (Pr(150 &lt; others)</w:t>
+        <w:t xml:space="preserve">For GII.4 antibodies, peak responses followed a non-monotone pattern, increasing up to the 50 dose and declining at the 150 dose for both IgA and IgG (Pr(50 &gt; 150) = 0.99 and 0.95, respectively). The 150 dose also decayed more slowly than the other doses (Pr(150 &lt; 5), Pr(150 &lt; 15), and Pr(150 &lt; 50)</w:t>
       </w:r>
       <w:r>
         <w:t xml:space="preserve"> </w:t>
@@ -3994,7 +3994,7 @@
               <w:t xml:space="preserve"> </w:t>
             </w:r>
             <w:r>
-              <w:t xml:space="preserve">Power-law model-derived antibody kinetic measures following norovirus vaccination by assigned dose. Growth rate (per day), peak response, time of peak (days), decay rate (per day; evaluated at day 90), and predicted response at one year are shown, with rows corresponding to kinetic measure and columns corresponding to antibody type. Solid points denote population-level posterior estimates, with vertical lines indicating 95% MAD-based credible intervals (CIs). For visualization purposes, the y-axis scale for growth rate was truncated. The upper bound of the 95% CIs for GI.1 IgA antibody growth rate at the 50 and 150 doses were 4.80 and 4.98, respectively. For GII.4 IgA, they were 5.42 (50) and 4.39 (150).</w:t>
+              <w:t xml:space="preserve">Power-law model-derived antibody kinetic measures following norovirus vaccination by assigned dose. Growth rate (per day), peak response, time of peak (days), decay rate (per day; evaluated at day 90), and predicted response at one year are shown, with rows corresponding to kinetic measure and columns corresponding to antibody type. Solid points denote population-level posterior estimates, with vertical lines indicating 95% equal-tailed credible intervals (CIs). For visualization purposes, the y-axis scale for growth rate was truncated. The upper bound of the 95% CIs for GI.1 IgA antibody growth rate at the 50 and 150 doses were 4.80 and 4.98, respectively. For GII.4 IgA, they were 5.42 (50) and 4.39 (150).</w:t>
             </w:r>
           </w:p>
           <w:bookmarkEnd w:id="47"/>
@@ -4080,7 +4080,7 @@
         <w:t xml:space="preserve"> </w:t>
       </w:r>
       <w:r>
-        <w:t xml:space="preserve">A and SM 3.4). This association did not hold across all posterior draws.</w:t>
+        <w:t xml:space="preserve">A and SM S3.4). This association did not hold across all posterior draws.</w:t>
       </w:r>
     </w:p>
     <w:p>
@@ -4116,7 +4116,7 @@
         <w:t xml:space="preserve"> </w:t>
       </w:r>
       <w:r>
-        <w:t xml:space="preserve">B and SM 3.4). The HBGA-blocking and IgA antibodies held this association across all draws (</w:t>
+        <w:t xml:space="preserve">B and SM S3.4). The HBGA-blocking and IgA antibodies held this association across all draws (</w:t>
       </w:r>
       <m:oMath>
         <m:r>
@@ -4174,7 +4174,7 @@
         <w:t xml:space="preserve"> </w:t>
       </w:r>
       <w:r>
-        <w:t xml:space="preserve">C and SM 3.4). This within-dose association held across all draws for HBGA and IgG (</w:t>
+        <w:t xml:space="preserve">C and SM S3.4). This within-dose association held across all draws for HBGA and IgG (</w:t>
       </w:r>
       <m:oMath>
         <m:r>
@@ -4277,7 +4277,7 @@
               <w:t xml:space="preserve"> </w:t>
             </w:r>
             <w:r>
-              <w:t xml:space="preserve">Power-law model-predicted antibody kinetic measures by study, dose, and antibody. Growth rate (per day), peak response, and decay rate (per day; evaluated at day 90) are plotted against predicted response at one year. Larger points represent study- and dose-specific posterior medians, while smaller points show a randomly selected subset of 500 posterior draws per study and dose, sampled after removing the upper and lower 5% of draws for each measure. Color and shape indicate study and dose, with triangle variations for the NI study and square variations for the NV study. For visualization purposes, the growth rate plot is scaled to display only the lower 95% of sampled draws to avoid skewing by extreme values. Only GI.1 antibodies are shown, as these were measured in both studies. GII.4-specific results from the NV study are provided in the SM S3.4.</w:t>
+              <w:t xml:space="preserve">Power-law model-predicted antibody kinetic measures by study, dose, and antibody. Growth rate (per day), peak response, and decay rate (per day; evaluated at day 90) are plotted against predicted response at one year. Larger points represent study- and dose-specific posterior medians, while smaller points show a randomly selected subset of 500 posterior draws per study and dose, sampled after restricting to draws that fall within the 5th to 95th percentile range for all measures. Color and shape indicate study and dose, with triangle variations for the NI study and square variations for the NV study. For visualization purposes, the growth rate plot is scaled to display only the lower 95% of sampled draws to avoid skewing by extreme values. Only GI.1 antibodies are shown, as these were measured in both studies. GII.4-specific results from the NV study are provided in the SM S3.4.</w:t>
             </w:r>
           </w:p>
           <w:bookmarkEnd w:id="52"/>
@@ -4289,7 +4289,7 @@
         <w:pStyle w:val="BodyText"/>
       </w:pPr>
       <w:r>
-        <w:t xml:space="preserve">Within dose groups, growth rate, peak response, and decay rate were all independently associated with predicted one-year response. Growth rate and peak response were themselves strongly correlated (see SM 3.4), and peak response showed stronger associations with one-year response. Prior studies of other antigens have reported a positive coupling between peak and subsequent waning, such that stronger early responses decay more rapidly</w:t>
+        <w:t xml:space="preserve">Within dose groups, growth rate, peak response, and decay rate were all independently associated with predicted one-year response. Growth rate and peak response were themselves strongly correlated (see SM S3.4), and peak response showed stronger associations with one-year response. Prior studies of other antigens have reported a positive coupling between peak and subsequent waning, such that stronger early responses decay more rapidly</w:t>
       </w:r>
       <w:r>
         <w:t xml:space="preserve"> </w:t>
@@ -4429,7 +4429,7 @@
               <w:t xml:space="preserve"> </w:t>
             </w:r>
             <w:r>
-              <w:t xml:space="preserve">Joint relationships of peak response, decay rate (per day; evaluated at day 90), and predicted response at one year. Panel A shows peak response versus decay rate, with study- and dose-specific points indicated by shape and color. Triangle variations are used for the NI study and square variations for the NV study. Panel B shows the same relationship but with color representing predicted antibody response at one year. Antibody-specific color scales are shown underneath their corresponding plot. Larger points denote posterior medians. Smaller points represent a random subset of 500 posterior draws per dose, sampled after removing the upper and lower 5% of draws. Only GI.1 antibodies are shown, as these were measured in both studies. GII.4-specific results from the NV study are provided in the SM S3.4.</w:t>
+              <w:t xml:space="preserve">Joint relationships of peak response, decay rate (per day; evaluated at day 90), and predicted response at one year. Panel A shows peak response versus decay rate, with study- and dose-specific points indicated by shape and color. Triangle variations are used for the NI study and square variations for the NV study. Panel B shows the same relationship but with color representing predicted antibody response at one year. Antibody-specific color scales are shown underneath their corresponding plot. Larger points denote posterior medians. Smaller points represent a random subset of 500 posterior draws per dose, sampled after restricting to draws that fall within the 5th to 95th percentile range for all measures. Only GI.1 antibodies are shown, as these were measured in both studies. GII.4-specific results from the NV study are provided in the SM S3.4.</w:t>
             </w:r>
           </w:p>
           <w:bookmarkEnd w:id="56"/>
@@ -4781,7 +4781,7 @@
         </m:r>
       </m:oMath>
       <w:r>
-        <w:t xml:space="preserve">-fold rise in serum antibody titers from baseline to day 28.</w:t>
+        <w:t xml:space="preserve">-fold rise in serum antibody titers from baseline to day 28. All infected participants met criterion (ii); 16 of 19 also met criterion (i), with the three exceptions being two participants in the 4.8 dose group and one in the 4800 dose group.</w:t>
       </w:r>
     </w:p>
     <w:p>
@@ -5331,7 +5331,7 @@
         <w:t xml:space="preserve"> </w:t>
       </w:r>
       <w:r>
-        <w:t xml:space="preserve">controls the peak antibody level,</w:t>
+        <w:t xml:space="preserve">controls the asymptotic amplitude of the induction term,</w:t>
       </w:r>
       <w:r>
         <w:t xml:space="preserve"> </w:t>
@@ -5354,7 +5354,7 @@
         <w:t xml:space="preserve"> </w:t>
       </w:r>
       <w:r>
-        <w:t xml:space="preserve">represents the initial growth rate,</w:t>
+        <w:t xml:space="preserve">represents the growth rate,</w:t>
       </w:r>
       <w:r>
         <w:t xml:space="preserve"> </w:t>
@@ -5377,7 +5377,7 @@
         <w:t xml:space="preserve"> </w:t>
       </w:r>
       <w:r>
-        <w:t xml:space="preserve">the time at peak, and</w:t>
+        <w:t xml:space="preserve">the inflection point, and</w:t>
       </w:r>
       <w:r>
         <w:t xml:space="preserve"> </w:t>
@@ -5494,7 +5494,172 @@
         <w:pStyle w:val="BodyText"/>
       </w:pPr>
       <w:r>
-        <w:t xml:space="preserve">Although the NV study included a two-dose vaccination regimen, individual antibody trajectories exhibited a single peak, typically occurring between the first and second doses, with little evidence of a distinct second peak following the booster (see SM S3.2.1). We therefore applied the same single-peak models to both the NI and NV studies. We converted antibody titer data and models to natural log units for model fitting.</w:t>
+        <w:t xml:space="preserve">Although the NV study included a two-dose vaccination regimen, individual antibody trajectories exhibited a single peak, typically occurring between the first and second doses, with little evidence of a distinct second peak following the booster (see SM S3.2.1). We therefore applied the same single-peak models to both the NI and NV studies. All antibody titers were log-transformed prior to model fitting. Models were specified on the log scale, with</w:t>
+      </w:r>
+      <w:r>
+        <w:t xml:space="preserve"> </w:t>
+      </w:r>
+      <m:oMath>
+        <m:sSub>
+          <m:e>
+            <m:r>
+              <m:t>η</m:t>
+            </m:r>
+          </m:e>
+          <m:sub>
+            <m:r>
+              <m:t>i</m:t>
+            </m:r>
+            <m:r>
+              <m:rPr>
+                <m:sty m:val="p"/>
+              </m:rPr>
+              <m:t>,</m:t>
+            </m:r>
+            <m:r>
+              <m:t>t</m:t>
+            </m:r>
+          </m:sub>
+        </m:sSub>
+      </m:oMath>
+      <w:r>
+        <w:t xml:space="preserve"> </w:t>
+      </w:r>
+      <w:r>
+        <w:t xml:space="preserve">=</w:t>
+      </w:r>
+      <w:r>
+        <w:t xml:space="preserve"> </w:t>
+      </w:r>
+      <m:oMath>
+        <m:r>
+          <m:t>E</m:t>
+        </m:r>
+        <m:d>
+          <m:dPr>
+            <m:begChr m:val="["/>
+            <m:sepChr m:val=""/>
+            <m:endChr m:val="]"/>
+            <m:grow/>
+          </m:dPr>
+          <m:e>
+            <m:r>
+              <m:rPr>
+                <m:nor/>
+                <m:sty m:val="p"/>
+              </m:rPr>
+              <m:t>log</m:t>
+            </m:r>
+            <m:d>
+              <m:dPr>
+                <m:begChr m:val="("/>
+                <m:sepChr m:val=""/>
+                <m:endChr m:val=")"/>
+                <m:grow/>
+              </m:dPr>
+              <m:e>
+                <m:sSub>
+                  <m:e>
+                    <m:r>
+                      <m:t>y</m:t>
+                    </m:r>
+                  </m:e>
+                  <m:sub>
+                    <m:r>
+                      <m:t>i</m:t>
+                    </m:r>
+                    <m:r>
+                      <m:rPr>
+                        <m:sty m:val="p"/>
+                      </m:rPr>
+                      <m:t>,</m:t>
+                    </m:r>
+                    <m:r>
+                      <m:t>t</m:t>
+                    </m:r>
+                  </m:sub>
+                </m:sSub>
+              </m:e>
+            </m:d>
+          </m:e>
+        </m:d>
+      </m:oMath>
+      <w:r>
+        <w:t xml:space="preserve"> </w:t>
+      </w:r>
+      <w:r>
+        <w:t xml:space="preserve">denoting the expected log titer for individual</w:t>
+      </w:r>
+      <w:r>
+        <w:t xml:space="preserve"> </w:t>
+      </w:r>
+      <m:oMath>
+        <m:r>
+          <m:t>i</m:t>
+        </m:r>
+      </m:oMath>
+      <w:r>
+        <w:t xml:space="preserve"> </w:t>
+      </w:r>
+      <w:r>
+        <w:t xml:space="preserve">at time</w:t>
+      </w:r>
+      <w:r>
+        <w:t xml:space="preserve"> </w:t>
+      </w:r>
+      <m:oMath>
+        <m:r>
+          <m:t>t</m:t>
+        </m:r>
+      </m:oMath>
+      <w:r>
+        <w:t xml:space="preserve">, and a Student-t likelihood placed directly on</w:t>
+      </w:r>
+      <w:r>
+        <w:t xml:space="preserve"> </w:t>
+      </w:r>
+      <m:oMath>
+        <m:r>
+          <m:rPr>
+            <m:nor/>
+            <m:sty m:val="p"/>
+          </m:rPr>
+          <m:t>log</m:t>
+        </m:r>
+        <m:d>
+          <m:dPr>
+            <m:begChr m:val="("/>
+            <m:sepChr m:val=""/>
+            <m:endChr m:val=")"/>
+            <m:grow/>
+          </m:dPr>
+          <m:e>
+            <m:sSub>
+              <m:e>
+                <m:r>
+                  <m:t>y</m:t>
+                </m:r>
+              </m:e>
+              <m:sub>
+                <m:r>
+                  <m:t>i</m:t>
+                </m:r>
+                <m:r>
+                  <m:rPr>
+                    <m:sty m:val="p"/>
+                  </m:rPr>
+                  <m:t>,</m:t>
+                </m:r>
+                <m:r>
+                  <m:t>t</m:t>
+                </m:r>
+              </m:sub>
+            </m:sSub>
+          </m:e>
+        </m:d>
+      </m:oMath>
+      <w:r>
+        <w:t xml:space="preserve">.</w:t>
       </w:r>
     </w:p>
     <w:p>
@@ -5502,7 +5667,7 @@
         <w:pStyle w:val="BodyText"/>
       </w:pPr>
       <w:r>
-        <w:t xml:space="preserve">We fit models separately for each study and antibody type, including dose as a fixed effect and subject-specific random intercepts to capture individual-level variation. We identified censored observations based on assay characteristics, prior literature, or apparent clustering in the data. For HBGA, the assay detection range was 25 to 3200. In the NI study, the lower detection limit was 0.8 for IgA and 0.7 for IgG. In the NV study, the lower limits were 3.1 for IgA and 1.6 for IgG. We treated values at or exceeding the upper detection limit as right-censored and values at or below the lower detection limit as interval-censored between</w:t>
+        <w:t xml:space="preserve">We fit models separately for each study and antibody type, including dose as a fixed effect and subject-specific random effects on the latent kinetic parameters to capture individual-level variation. We identified censored observations based on assay characteristics, prior literature, or apparent clustering in the data. For HBGA, the assay detection range was 25 to 3200. In the NI study, the lower detection limit was 0.8 for IgA and 0.7 for IgG. In the NV study, the lower limits were 3.1 for IgA and 1.6 for IgG. We treated values at or exceeding the upper detection limit as right-censored and values at or below the lower detection limit as interval-censored between</w:t>
       </w:r>
       <w:r>
         <w:t xml:space="preserve"> </w:t>
@@ -5817,7 +5982,7 @@
         <w:t xml:space="preserve"> </w:t>
       </w:r>
       <w:r>
-        <w:t xml:space="preserve">using the cmdrstan backend and cmdrstan version 2.38.0</w:t>
+        <w:t xml:space="preserve">using the cmdstanr backend and cmdstanr version 2.38.0</w:t>
       </w:r>
       <w:r>
         <w:t xml:space="preserve"> </w:t>

</xml_diff>